<commit_message>
DOC: Umbenennen/Abwaehlen und Quelltextvergleich dokumentiert
Spezifikation 5.8 und 5.9 (die Umbenennungsliste war ueberhaupt noch
nicht beschrieben), beide HTML-Dokumentationen, die Reportdokumentation
im System und die Produktdokumentation in beiden Sprachen.

Neu unter den offenen Punkten: der Strukturvergleich fuer DDIC-Objekte
und das Erkennen geloeschter Objekte beim Sender - letzteres mit der
Begruendung, warum es heute nicht geht (der Startpunkt steht nicht im
Kopf des Dokuments) und welche drei Einschraenkungen dazugehoeren.

Das deutsche PDF fehlt: die Datei ist in einem anderen Programm offen.

Co-Authored-By: Claude Opus 5 <noreply@anthropic.com>
</commit_message>
<xml_diff>
--- a/docs/Documizer_Product_Documentation.docx
+++ b/docs/Documizer_Product_Documentation.docx
@@ -13969,6 +13969,60 @@
           <w:lang w:val="en-GB"/>
         </w:rPr>
         <w:t xml:space="preserve"> Every step reports what it would do — writing happens only once you deliberately clear the flag.</w:t>
+      </w:r>
+    </w:p>
+    <w:p>
+      <w:pPr>
+        <w:pStyle w:val="Listenabsatz"/>
+        <w:numPr>
+          <w:ilvl w:val="0"/>
+          <w:numId w:val="2"/>
+        </w:numPr>
+        <w:spacing w:after="80" w:line="276" w:lineRule="auto"/>
+        <w:rPr>
+          <w:lang w:val="en-GB"/>
+        </w:rPr>
+      </w:pPr>
+      <w:r>
+        <w:rPr>
+          <w:b/>
+          <w:bCs/>
+          <w:lang w:val="en-GB"/>
+        </w:rPr>
+        <w:t>You pick what arrives. </w:t>
+      </w:r>
+      <w:r>
+        <w:rPr>
+          <w:lang w:val="en-GB"/>
+        </w:rPr>
+        <w:t xml:space="preserve">A list in front of the import shows every object in the document. Each row can take a different target name and target package — or be skipped entirely, so the object is neither created nor changed. Every skipped row is named in the log.</w:t>
+      </w:r>
+    </w:p>
+    <w:p>
+      <w:pPr>
+        <w:pStyle w:val="Listenabsatz"/>
+        <w:numPr>
+          <w:ilvl w:val="0"/>
+          <w:numId w:val="2"/>
+        </w:numPr>
+        <w:spacing w:after="80" w:line="276" w:lineRule="auto"/>
+        <w:rPr>
+          <w:lang w:val="en-GB"/>
+        </w:rPr>
+      </w:pPr>
+      <w:r>
+        <w:rPr>
+          <w:b/>
+          <w:bCs/>
+          <w:lang w:val="en-GB"/>
+        </w:rPr>
+        <w:t>The test run shows the difference. </w:t>
+      </w:r>
+      <w:r>
+        <w:rPr>
+          <w:lang w:val="en-GB"/>
+        </w:rPr>
+        <w:t xml:space="preserve">For every object that already exists in the target system it compares the source: new lines in green, dropped ones in red, unchanged stretches summarised. Instead of “would be changed” you see what changes.</w:t>
       </w:r>
     </w:p>
     <w:p>

</xml_diff>

<commit_message>
DOC: Handbuecher mit dem Auftragskapitel neu gebaut
Beide Fassungen nachgezogen, nachdem die Dateien wieder frei waren:
der Hinweis, dass der Auftrag in Kapitel 1 steht und die Objekte bei 2
beginnen. 23 Seiten deutsch, 22 englisch, Inhaltsverzeichnisse
aktualisiert.

Co-Authored-By: Claude Opus 5 <noreply@anthropic.com>
</commit_message>
<xml_diff>
--- a/docs/Documizer_Product_Documentation.docx
+++ b/docs/Documizer_Product_Documentation.docx
@@ -6256,7 +6256,17 @@
         <w:t xml:space="preserve">TR</w:t>
       </w:r>
       <w:r>
-        <w:t xml:space="preserve"> the name field takes a request or task number; the value help shows your own requests, the most recent first. The header of the run names kind and status, short text, owner, date, target system and the tasks below it. Three peculiarities of the correction system are taken off your hands:</w:t>
+        <w:t xml:space="preserve"> the name field takes a request or task number; the value help shows your own requests, the most recent first. </w:t>
+      </w:r>
+      <w:r>
+        <w:rPr>
+          <w:b/>
+          <w:bCs/>
+        </w:rPr>
+        <w:t xml:space="preserve">The request itself is chapter 1</w:t>
+      </w:r>
+      <w:r>
+        <w:t xml:space="preserve"> — with its number, kind, status, short text, owner, date, target system and the number of tasks; the objects start at 2. Three peculiarities of the correction system are taken off your hands:</w:t>
       </w:r>
     </w:p>
     <w:p>

</xml_diff>